<commit_message>
compliance: fill DPO contact email (iscasasolaii@gmail.com) across the pack
Owner supplied the DPO contact email. Replaced the [TO CONFIRM — DPO email]
placeholder with iscasasolaii@gmail.com everywhere in NPC_Compliance/00-08 +
the Privacy Policy (DPO identity lines, data-subject rights channels, breach
contacts, NPC data sheet). Regenerated all .docx mirrors. Minor: facts register
+ DECISION_LOG updated to reflect the email is now supplied.

Co-Authored-By: Claude Opus 4.8 <noreply@anthropic.com>
</commit_message>
<xml_diff>
--- a/NPC_Compliance/01_Privacy_Manual_DRAFT_2026-07-05.docx
+++ b/NPC_Compliance/01_Privacy_Manual_DRAFT_2026-07-05.docx
@@ -1106,7 +1106,7 @@
                 <w:b/>
                 <w:bCs/>
               </w:rPr>
-              <w:t xml:space="preserve">[TO CONFIRM — DPO email]</w:t>
+              <w:t xml:space="preserve">iscasasolaii@gmail.com</w:t>
             </w:r>
           </w:p>
         </w:tc>
@@ -1869,7 +1869,7 @@
         </w:numPr>
       </w:pPr>
       <w:r>
-        <w:t xml:space="preserve">The DPO’s contact ([TO CONFIRM — DPO email]) is published as the channel for questions and rights requests.</w:t>
+        <w:t xml:space="preserve">The DPO’s contact (iscasasolaii@gmail.com) is published as the channel for questions and rights requests.</w:t>
       </w:r>
     </w:p>
     <w:bookmarkEnd w:id="21"/>
@@ -3000,7 +3000,7 @@
           <w:b/>
           <w:bCs/>
         </w:rPr>
-        <w:t xml:space="preserve">[TO CONFIRM — DPO email]</w:t>
+        <w:t xml:space="preserve">iscasasolaii@gmail.com</w:t>
       </w:r>
       <w:r>
         <w:t xml:space="preserve"> </w:t>
@@ -3132,7 +3132,7 @@
               <w:pStyle w:val="Compact"/>
             </w:pPr>
             <w:r>
-              <w:t xml:space="preserve">Request a copy of personal data held, via [TO CONFIRM — DPO email].</w:t>
+              <w:t xml:space="preserve">Request a copy of personal data held, via iscasasolaii@gmail.com.</w:t>
             </w:r>
             <w:r>
               <w:t xml:space="preserve"> </w:t>
@@ -3187,7 +3187,7 @@
               <w:pStyle w:val="Compact"/>
             </w:pPr>
             <w:r>
-              <w:t xml:space="preserve">Opt out of specific data uses (e.g., marketing samples, promotional email) via settings or [TO CONFIRM — DPO email].</w:t>
+              <w:t xml:space="preserve">Opt out of specific data uses (e.g., marketing samples, promotional email) via settings or iscasasolaii@gmail.com.</w:t>
             </w:r>
           </w:p>
         </w:tc>
@@ -3226,7 +3226,7 @@
               <w:pStyle w:val="Compact"/>
             </w:pPr>
             <w:r>
-              <w:t xml:space="preserve">Edit profile in-app; request corrections via [TO CONFIRM — DPO email].</w:t>
+              <w:t xml:space="preserve">Edit profile in-app; request corrections via iscasasolaii@gmail.com.</w:t>
             </w:r>
           </w:p>
         </w:tc>
@@ -3368,7 +3368,7 @@
               <w:pStyle w:val="Compact"/>
             </w:pPr>
             <w:r>
-              <w:t xml:space="preserve">Export event data, photos, and chat history in a machine-readable format, via [TO CONFIRM — DPO email] or in-app export.</w:t>
+              <w:t xml:space="preserve">Export event data, photos, and chat history in a machine-readable format, via iscasasolaii@gmail.com or in-app export.</w:t>
             </w:r>
           </w:p>
         </w:tc>
@@ -3621,7 +3621,7 @@
         <w:t xml:space="preserve"> </w:t>
       </w:r>
       <w:r>
-        <w:t xml:space="preserve">Consent may be withdrawn at any time through settings or [TO CONFIRM — DPO email], without affecting the lawfulness of prior processing.</w:t>
+        <w:t xml:space="preserve">Consent may be withdrawn at any time through settings or iscasasolaii@gmail.com, without affecting the lawfulness of prior processing.</w:t>
       </w:r>
     </w:p>
     <w:p>
@@ -4457,7 +4457,7 @@
           <w:b/>
           <w:bCs/>
         </w:rPr>
-        <w:t xml:space="preserve">[TO CONFIRM — DPO email]</w:t>
+        <w:t xml:space="preserve">iscasasolaii@gmail.com</w:t>
       </w:r>
       <w:r>
         <w:t xml:space="preserve">; a hotline is used for high-severity incidents.</w:t>
@@ -4661,7 +4661,7 @@
           <w:b/>
           <w:bCs/>
         </w:rPr>
-        <w:t xml:space="preserve">[TO CONFIRM — DPO email]</w:t>
+        <w:t xml:space="preserve">iscasasolaii@gmail.com</w:t>
       </w:r>
       <w:r>
         <w:t xml:space="preserve">. The DPO acknowledges and responds within the timelines in § 6, coordinates rectification/erasure/objection, and maintains a record of complaints and their resolution.</w:t>

</xml_diff>